<commit_message>
Update data access documentation to reflect SEER DUA compliance
</commit_message>
<xml_diff>
--- a/SEER_Lung_Cancer_Analysis.docx
+++ b/SEER_Lung_Cancer_Analysis.docx
@@ -127,6 +127,29 @@
     </w:p>
     <w:p>
       <w:pPr>
+        <w:spacing w:after="60" w:before="60"/>
+      </w:pPr>
+      <w:r>
+        <w:rPr>
+          <w:rFonts w:ascii="Arial" w:cs="Arial" w:eastAsia="Arial" w:hAnsi="Arial"/>
+          <w:b/>
+          <w:bCs/>
+          <w:sz w:val="20"/>
+          <w:szCs w:val="20"/>
+        </w:rPr>
+        <w:t xml:space="preserve">Data Access: </w:t>
+      </w:r>
+      <w:r>
+        <w:rPr>
+          <w:rFonts w:ascii="Arial" w:cs="Arial" w:eastAsia="Arial" w:hAnsi="Arial"/>
+          <w:sz w:val="20"/>
+          <w:szCs w:val="20"/>
+        </w:rPr>
+        <w:t xml:space="preserve">SEER data (including raw extracts and any patient-level derived files) is not distributed with this report or its accompanying repository, per the terms of the SEER Research Data Use Agreement. Researchers wishing to reproduce this analysis should request their own SEER Research Data access at seer.cancer.gov/data/access.html and construct an extract using the variable list and SQL query documented in this report.</w:t>
+      </w:r>
+    </w:p>
+    <w:p>
+      <w:pPr>
         <w:spacing w:after="80" w:before="80"/>
       </w:pPr>
     </w:p>
@@ -603,7 +626,7 @@
                 <w:sz w:val="19"/>
                 <w:szCs w:val="19"/>
               </w:rPr>
-              <w:t xml:space="preserve">Example file (truncated)</w:t>
+              <w:t xml:space="preserve">Raw data extract</w:t>
             </w:r>
           </w:p>
         </w:tc>
@@ -631,7 +654,7 @@
                 <w:sz w:val="19"/>
                 <w:szCs w:val="19"/>
               </w:rPr>
-              <w:t xml:space="preserve">SEER_LUNG_11_14_EXT.csv (2014 only)</w:t>
+              <w:t xml:space="preserve">Not included in this repository (see Data Source, Section 1)</w:t>
             </w:r>
           </w:p>
         </w:tc>
@@ -17480,7 +17503,7 @@
           <w:sz w:val="18"/>
           <w:szCs w:val="18"/>
         </w:rPr>
-        <w:t xml:space="preserve">Note: SEER_LUNG_11_14_EXT.csv is a truncated example file containing only 2014 records. Full analysis requires the complete SEER SQL export.</w:t>
+        <w:t xml:space="preserve">Note: SEER data used in this analysis is not included in this repository or document, per the terms of the SEER Research Data Use Agreement (redistribution of SEER data, or data derived from it, is not permitted). To reproduce this analysis, request SEER Research Data access at seer.cancer.gov/data/access.html and construct an extract using the SQL query and variable list documented in this report.</w:t>
       </w:r>
     </w:p>
     <w:sectPr>

</xml_diff>